<commit_message>
paper7: final manuscript.docx (DOI v2.1.0)
</commit_message>
<xml_diff>
--- a/manuscript/paper7/manuscript.docx
+++ b/manuscript/paper7/manuscript.docx
@@ -5157,7 +5157,7 @@
           <w:color w:val="000000"/>
           <w:sz w:val="24"/>
         </w:rPr>
-        <w:t>Code and data are publicly available at</w:t>
+        <w:t>All data, code, models, and the manuscript are publicly available at</w:t>
       </w:r>
     </w:p>
     <w:p>
@@ -5169,7 +5169,7 @@
           <w:color w:val="000000"/>
           <w:sz w:val="24"/>
         </w:rPr>
-        <w:t>https://github.com/linfuxing123/IL-Property-ML (version DOI to be assigned on</w:t>
+        <w:t>https://github.com/linfuxing123/IL-Property-ML (release v2.1.0, archived at</w:t>
       </w:r>
     </w:p>
     <w:p>
@@ -5181,7 +5181,43 @@
           <w:color w:val="000000"/>
           <w:sz w:val="24"/>
         </w:rPr>
-        <w:t>release, planned v2.1.0).</w:t>
+        <w:t>https://doi.org/10.5281/zenodo.21941824). The archive contains the scoring</w:t>
+      </w:r>
+    </w:p>
+    <w:p>
+      <w:r>
+        <w:rPr>
+          <w:rFonts w:ascii="Times New Roman" w:hAnsi="Times New Roman" w:eastAsia="宋体"/>
+          <w:b w:val="0"/>
+          <w:i w:val="0"/>
+          <w:color w:val="000000"/>
+          <w:sz w:val="24"/>
+        </w:rPr>
+        <w:t>tables (1.68M IL pairs × four properties), the ILPE overlap data, all</w:t>
+      </w:r>
+    </w:p>
+    <w:p>
+      <w:r>
+        <w:rPr>
+          <w:rFonts w:ascii="Times New Roman" w:hAnsi="Times New Roman" w:eastAsia="宋体"/>
+          <w:b w:val="0"/>
+          <w:i w:val="0"/>
+          <w:color w:val="000000"/>
+          <w:sz w:val="24"/>
+        </w:rPr>
+        <w:t>statistics tables, all analysis scripts, and this manuscript with its figures.</w:t>
+      </w:r>
+    </w:p>
+    <w:p>
+      <w:r>
+        <w:rPr>
+          <w:rFonts w:ascii="Times New Roman" w:hAnsi="Times New Roman" w:eastAsia="宋体"/>
+          <w:b w:val="0"/>
+          <w:i w:val="0"/>
+          <w:color w:val="000000"/>
+          <w:sz w:val="24"/>
+        </w:rPr>
+        <w:t>Underlying public sources are listed in refs [1,2].</w:t>
       </w:r>
     </w:p>
     <w:p>

</xml_diff>